<commit_message>
Complete Sprint 18.3.1 illustrated manual
</commit_message>
<xml_diff>
--- a/docs/Omni-Comprehensive-User-and-Administrator-Manual.docx
+++ b/docs/Omni-Comprehensive-User-and-Administrator-Manual.docx
@@ -162,7 +162,7 @@
                 <w:color w:val="1F2933"/>
                 <w:sz w:val="18"/>
               </w:rPr>
-              <w:t>1.0</w:t>
+              <w:t>1.1</w:t>
             </w:r>
           </w:p>
         </w:tc>
@@ -240,7 +240,7 @@
                 <w:color w:val="1F2933"/>
                 <w:sz w:val="18"/>
               </w:rPr>
-              <w:t>Omni local web application through Sprint 18.2</w:t>
+              <w:t>Omni local web application through Sprint 18.3.1</w:t>
             </w:r>
           </w:p>
         </w:tc>
@@ -506,7 +506,7 @@
                 <w:color w:val="1F2933"/>
                 <w:sz w:val="18"/>
               </w:rPr>
-              <w:t>1.0</w:t>
+              <w:t>1.1</w:t>
             </w:r>
           </w:p>
         </w:tc>
@@ -542,6 +542,83 @@
                 <w:color w:val="1F2933"/>
                 <w:sz w:val="18"/>
               </w:rPr>
+              <w:t>Added synthetic, annotated application screenshots for Sprint 18.3.1</w:t>
+            </w:r>
+          </w:p>
+        </w:tc>
+        <w:tc>
+          <w:tcPr>
+            <w:tcW w:type="dxa" w:w="1500"/>
+          </w:tcPr>
+          <w:p>
+            <w:pPr>
+              <w:spacing w:after="0"/>
+            </w:pPr>
+            <w:r>
+              <w:rPr>
+                <w:rFonts w:ascii="Aptos" w:hAnsi="Aptos"/>
+                <w:color w:val="1F2933"/>
+                <w:sz w:val="18"/>
+              </w:rPr>
+              <w:t>R!SC</w:t>
+            </w:r>
+          </w:p>
+        </w:tc>
+      </w:tr>
+      <w:tr>
+        <w:tc>
+          <w:tcPr>
+            <w:tcW w:type="dxa" w:w="1100"/>
+            <w:shd w:fill="F2F4F7"/>
+          </w:tcPr>
+          <w:p>
+            <w:pPr>
+              <w:spacing w:after="0"/>
+            </w:pPr>
+            <w:r>
+              <w:rPr>
+                <w:rFonts w:ascii="Aptos" w:hAnsi="Aptos"/>
+                <w:color w:val="1F2933"/>
+                <w:sz w:val="18"/>
+              </w:rPr>
+              <w:t>1.0</w:t>
+            </w:r>
+          </w:p>
+        </w:tc>
+        <w:tc>
+          <w:tcPr>
+            <w:tcW w:type="dxa" w:w="1900"/>
+            <w:shd w:fill="F2F4F7"/>
+          </w:tcPr>
+          <w:p>
+            <w:pPr>
+              <w:spacing w:after="0"/>
+            </w:pPr>
+            <w:r>
+              <w:rPr>
+                <w:rFonts w:ascii="Aptos" w:hAnsi="Aptos"/>
+                <w:color w:val="1F2933"/>
+                <w:sz w:val="18"/>
+              </w:rPr>
+              <w:t>August 14, 2026</w:t>
+            </w:r>
+          </w:p>
+        </w:tc>
+        <w:tc>
+          <w:tcPr>
+            <w:tcW w:type="dxa" w:w="4860"/>
+            <w:shd w:fill="F2F4F7"/>
+          </w:tcPr>
+          <w:p>
+            <w:pPr>
+              <w:spacing w:after="0"/>
+            </w:pPr>
+            <w:r>
+              <w:rPr>
+                <w:rFonts w:ascii="Aptos" w:hAnsi="Aptos"/>
+                <w:color w:val="1F2933"/>
+                <w:sz w:val="18"/>
+              </w:rPr>
               <w:t>Initial comprehensive user and administrator manual for Sprint 18.3</w:t>
             </w:r>
           </w:p>
@@ -549,6 +626,7 @@
         <w:tc>
           <w:tcPr>
             <w:tcW w:type="dxa" w:w="1500"/>
+            <w:shd w:fill="F2F4F7"/>
           </w:tcPr>
           <w:p>
             <w:pPr>
@@ -1823,6 +1901,1027 @@
       <w:pPr>
         <w:spacing w:after="20"/>
       </w:pPr>
+    </w:p>
+    <w:p>
+      <w:pPr>
+        <w:pStyle w:val="Heading2"/>
+      </w:pPr>
+      <w:r>
+        <w:t>2.4 Illustrated end-to-end walkthrough</w:t>
+      </w:r>
+    </w:p>
+    <w:p>
+      <w:pPr>
+        <w:pStyle w:val="OmniNote"/>
+      </w:pPr>
+      <w:r>
+        <w:rPr>
+          <w:rFonts w:ascii="Aptos" w:hAnsi="Aptos"/>
+          <w:b/>
+          <w:color w:val="15324B"/>
+        </w:rPr>
+        <w:t xml:space="preserve">Synthetic data: </w:t>
+      </w:r>
+      <w:r>
+        <w:rPr>
+          <w:rFonts w:ascii="Aptos" w:hAnsi="Aptos"/>
+          <w:color w:val="1F2933"/>
+        </w:rPr>
+        <w:t>Every screenshot in this manual was captured from an isolated demonstration database containing fictional names, accounts, systems, controls, evidence, remediation, and risk records. No client or organization data is shown.</w:t>
+      </w:r>
+    </w:p>
+    <w:p>
+      <w:r>
+        <w:t>Follow the numbered markers in each illustration and the matching instructions below it. Screen contents vary by role, assessment state, selected frameworks, and whether optional risk management is enabled.</w:t>
+      </w:r>
+    </w:p>
+    <w:p>
+      <w:r>
+        <w:br w:type="page"/>
+      </w:r>
+    </w:p>
+    <w:p>
+      <w:pPr>
+        <w:pStyle w:val="Heading2"/>
+      </w:pPr>
+      <w:r>
+        <w:t>Sign in</w:t>
+      </w:r>
+    </w:p>
+    <w:p>
+      <w:r>
+        <w:drawing>
+          <wp:inline xmlns:a="http://schemas.openxmlformats.org/drawingml/2006/main" xmlns:pic="http://schemas.openxmlformats.org/drawingml/2006/picture">
+            <wp:extent cx="6080760" cy="3197466"/>
+            <wp:docPr id="2" name="Picture 2" descr="Annotated Omni application screenshot: Sign in; contains synthetic demonstration data"/>
+            <wp:cNvGraphicFramePr>
+              <a:graphicFrameLocks noChangeAspect="1"/>
+            </wp:cNvGraphicFramePr>
+            <a:graphic>
+              <a:graphicData uri="http://schemas.openxmlformats.org/drawingml/2006/picture">
+                <pic:pic>
+                  <pic:nvPicPr>
+                    <pic:cNvPr id="0" name="01-sign-in.png"/>
+                    <pic:cNvPicPr/>
+                  </pic:nvPicPr>
+                  <pic:blipFill>
+                    <a:blip r:embed="rId12"/>
+                    <a:stretch>
+                      <a:fillRect/>
+                    </a:stretch>
+                  </pic:blipFill>
+                  <pic:spPr>
+                    <a:xfrm>
+                      <a:off x="0" y="0"/>
+                      <a:ext cx="6080760" cy="3197466"/>
+                    </a:xfrm>
+                    <a:prstGeom prst="rect"/>
+                  </pic:spPr>
+                </pic:pic>
+              </a:graphicData>
+            </a:graphic>
+          </wp:inline>
+        </w:drawing>
+      </w:r>
+    </w:p>
+    <w:p>
+      <w:pPr>
+        <w:jc w:val="center"/>
+      </w:pPr>
+      <w:r>
+        <w:rPr>
+          <w:rFonts w:ascii="Aptos" w:hAnsi="Aptos"/>
+          <w:i/>
+          <w:color w:val="667085"/>
+          <w:sz w:val="18"/>
+        </w:rPr>
+        <w:t>Illustration: Sign in</w:t>
+      </w:r>
+    </w:p>
+    <w:p>
+      <w:pPr>
+        <w:ind w:left="259" w:hanging="259"/>
+      </w:pPr>
+      <w:r>
+        <w:rPr>
+          <w:rFonts w:ascii="Aptos" w:hAnsi="Aptos"/>
+          <w:b/>
+          <w:color w:val="15324B"/>
+          <w:sz w:val="20"/>
+        </w:rPr>
+        <w:t xml:space="preserve">1  </w:t>
+      </w:r>
+      <w:r>
+        <w:rPr>
+          <w:rFonts w:ascii="Aptos" w:hAnsi="Aptos"/>
+          <w:color w:val="1F2933"/>
+          <w:sz w:val="20"/>
+        </w:rPr>
+        <w:t>Enter your Omni account credentials.</w:t>
+      </w:r>
+    </w:p>
+    <w:p>
+      <w:pPr>
+        <w:ind w:left="259" w:hanging="259"/>
+      </w:pPr>
+      <w:r>
+        <w:rPr>
+          <w:rFonts w:ascii="Aptos" w:hAnsi="Aptos"/>
+          <w:b/>
+          <w:color w:val="15324B"/>
+          <w:sz w:val="20"/>
+        </w:rPr>
+        <w:t xml:space="preserve">2  </w:t>
+      </w:r>
+      <w:r>
+        <w:rPr>
+          <w:rFonts w:ascii="Aptos" w:hAnsi="Aptos"/>
+          <w:color w:val="1F2933"/>
+          <w:sz w:val="20"/>
+        </w:rPr>
+        <w:t>Select Sign in to open your authorized workspace.</w:t>
+      </w:r>
+    </w:p>
+    <w:p>
+      <w:r>
+        <w:br w:type="page"/>
+      </w:r>
+    </w:p>
+    <w:p>
+      <w:pPr>
+        <w:pStyle w:val="Heading2"/>
+      </w:pPr>
+      <w:r>
+        <w:t>Open or create an assessment</w:t>
+      </w:r>
+    </w:p>
+    <w:p>
+      <w:r>
+        <w:drawing>
+          <wp:inline xmlns:a="http://schemas.openxmlformats.org/drawingml/2006/main" xmlns:pic="http://schemas.openxmlformats.org/drawingml/2006/picture">
+            <wp:extent cx="6080760" cy="3197466"/>
+            <wp:docPr id="3" name="Picture 3" descr="Annotated Omni application screenshot: Open or create an assessment; contains synthetic demonstration data"/>
+            <wp:cNvGraphicFramePr>
+              <a:graphicFrameLocks noChangeAspect="1"/>
+            </wp:cNvGraphicFramePr>
+            <a:graphic>
+              <a:graphicData uri="http://schemas.openxmlformats.org/drawingml/2006/picture">
+                <pic:pic>
+                  <pic:nvPicPr>
+                    <pic:cNvPr id="0" name="04-assessments.png"/>
+                    <pic:cNvPicPr/>
+                  </pic:nvPicPr>
+                  <pic:blipFill>
+                    <a:blip r:embed="rId13"/>
+                    <a:stretch>
+                      <a:fillRect/>
+                    </a:stretch>
+                  </pic:blipFill>
+                  <pic:spPr>
+                    <a:xfrm>
+                      <a:off x="0" y="0"/>
+                      <a:ext cx="6080760" cy="3197466"/>
+                    </a:xfrm>
+                    <a:prstGeom prst="rect"/>
+                  </pic:spPr>
+                </pic:pic>
+              </a:graphicData>
+            </a:graphic>
+          </wp:inline>
+        </w:drawing>
+      </w:r>
+    </w:p>
+    <w:p>
+      <w:pPr>
+        <w:jc w:val="center"/>
+      </w:pPr>
+      <w:r>
+        <w:rPr>
+          <w:rFonts w:ascii="Aptos" w:hAnsi="Aptos"/>
+          <w:i/>
+          <w:color w:val="667085"/>
+          <w:sz w:val="18"/>
+        </w:rPr>
+        <w:t>Illustration: Open or create an assessment</w:t>
+      </w:r>
+    </w:p>
+    <w:p>
+      <w:pPr>
+        <w:ind w:left="259" w:hanging="259"/>
+      </w:pPr>
+      <w:r>
+        <w:rPr>
+          <w:rFonts w:ascii="Aptos" w:hAnsi="Aptos"/>
+          <w:b/>
+          <w:color w:val="15324B"/>
+          <w:sz w:val="20"/>
+        </w:rPr>
+        <w:t xml:space="preserve">1  </w:t>
+      </w:r>
+      <w:r>
+        <w:rPr>
+          <w:rFonts w:ascii="Aptos" w:hAnsi="Aptos"/>
+          <w:color w:val="1F2933"/>
+          <w:sz w:val="20"/>
+        </w:rPr>
+        <w:t>Open the applicable assessment period and purpose.</w:t>
+      </w:r>
+    </w:p>
+    <w:p>
+      <w:pPr>
+        <w:ind w:left="259" w:hanging="259"/>
+      </w:pPr>
+      <w:r>
+        <w:rPr>
+          <w:rFonts w:ascii="Aptos" w:hAnsi="Aptos"/>
+          <w:b/>
+          <w:color w:val="15324B"/>
+          <w:sz w:val="20"/>
+        </w:rPr>
+        <w:t xml:space="preserve">2  </w:t>
+      </w:r>
+      <w:r>
+        <w:rPr>
+          <w:rFonts w:ascii="Aptos" w:hAnsi="Aptos"/>
+          <w:color w:val="1F2933"/>
+          <w:sz w:val="20"/>
+        </w:rPr>
+        <w:t>Use New assessment to select one or more frameworks and load controls.</w:t>
+      </w:r>
+    </w:p>
+    <w:p>
+      <w:r>
+        <w:br w:type="page"/>
+      </w:r>
+    </w:p>
+    <w:p>
+      <w:pPr>
+        <w:pStyle w:val="Heading2"/>
+      </w:pPr>
+      <w:r>
+        <w:t>Use the executive dashboard</w:t>
+      </w:r>
+    </w:p>
+    <w:p>
+      <w:r>
+        <w:drawing>
+          <wp:inline xmlns:a="http://schemas.openxmlformats.org/drawingml/2006/main" xmlns:pic="http://schemas.openxmlformats.org/drawingml/2006/picture">
+            <wp:extent cx="6080760" cy="3197466"/>
+            <wp:docPr id="4" name="Picture 4" descr="Annotated Omni application screenshot: Use the executive dashboard; contains synthetic demonstration data"/>
+            <wp:cNvGraphicFramePr>
+              <a:graphicFrameLocks noChangeAspect="1"/>
+            </wp:cNvGraphicFramePr>
+            <a:graphic>
+              <a:graphicData uri="http://schemas.openxmlformats.org/drawingml/2006/picture">
+                <pic:pic>
+                  <pic:nvPicPr>
+                    <pic:cNvPr id="0" name="05-dashboard.png"/>
+                    <pic:cNvPicPr/>
+                  </pic:nvPicPr>
+                  <pic:blipFill>
+                    <a:blip r:embed="rId14"/>
+                    <a:stretch>
+                      <a:fillRect/>
+                    </a:stretch>
+                  </pic:blipFill>
+                  <pic:spPr>
+                    <a:xfrm>
+                      <a:off x="0" y="0"/>
+                      <a:ext cx="6080760" cy="3197466"/>
+                    </a:xfrm>
+                    <a:prstGeom prst="rect"/>
+                  </pic:spPr>
+                </pic:pic>
+              </a:graphicData>
+            </a:graphic>
+          </wp:inline>
+        </w:drawing>
+      </w:r>
+    </w:p>
+    <w:p>
+      <w:pPr>
+        <w:jc w:val="center"/>
+      </w:pPr>
+      <w:r>
+        <w:rPr>
+          <w:rFonts w:ascii="Aptos" w:hAnsi="Aptos"/>
+          <w:i/>
+          <w:color w:val="667085"/>
+          <w:sz w:val="18"/>
+        </w:rPr>
+        <w:t>Illustration: Use the executive dashboard</w:t>
+      </w:r>
+    </w:p>
+    <w:p>
+      <w:pPr>
+        <w:ind w:left="259" w:hanging="259"/>
+      </w:pPr>
+      <w:r>
+        <w:rPr>
+          <w:rFonts w:ascii="Aptos" w:hAnsi="Aptos"/>
+          <w:b/>
+          <w:color w:val="15324B"/>
+          <w:sz w:val="20"/>
+        </w:rPr>
+        <w:t xml:space="preserve">1  </w:t>
+      </w:r>
+      <w:r>
+        <w:rPr>
+          <w:rFonts w:ascii="Aptos" w:hAnsi="Aptos"/>
+          <w:color w:val="1F2933"/>
+          <w:sz w:val="20"/>
+        </w:rPr>
+        <w:t>Use the action bar to move between planning, execution, evidence, remediation, review, and reports.</w:t>
+      </w:r>
+    </w:p>
+    <w:p>
+      <w:pPr>
+        <w:ind w:left="259" w:hanging="259"/>
+      </w:pPr>
+      <w:r>
+        <w:rPr>
+          <w:rFonts w:ascii="Aptos" w:hAnsi="Aptos"/>
+          <w:b/>
+          <w:color w:val="15324B"/>
+          <w:sz w:val="20"/>
+        </w:rPr>
+        <w:t xml:space="preserve">2  </w:t>
+      </w:r>
+      <w:r>
+        <w:rPr>
+          <w:rFonts w:ascii="Aptos" w:hAnsi="Aptos"/>
+          <w:color w:val="1F2933"/>
+          <w:sz w:val="20"/>
+        </w:rPr>
+        <w:t>Monitor completion, results, evidence, remediation, deadlines, and optional risk indicators.</w:t>
+      </w:r>
+    </w:p>
+    <w:p>
+      <w:pPr>
+        <w:ind w:left="259" w:hanging="259"/>
+      </w:pPr>
+      <w:r>
+        <w:rPr>
+          <w:rFonts w:ascii="Aptos" w:hAnsi="Aptos"/>
+          <w:b/>
+          <w:color w:val="15324B"/>
+          <w:sz w:val="20"/>
+        </w:rPr>
+        <w:t xml:space="preserve">3  </w:t>
+      </w:r>
+      <w:r>
+        <w:rPr>
+          <w:rFonts w:ascii="Aptos" w:hAnsi="Aptos"/>
+          <w:color w:val="1F2933"/>
+          <w:sz w:val="20"/>
+        </w:rPr>
+        <w:t>Use dashboard actions to maintain authorized assessment settings.</w:t>
+      </w:r>
+    </w:p>
+    <w:p>
+      <w:r>
+        <w:br w:type="page"/>
+      </w:r>
+    </w:p>
+    <w:p>
+      <w:pPr>
+        <w:pStyle w:val="Heading2"/>
+      </w:pPr>
+      <w:r>
+        <w:t>Complete the assessment plan</w:t>
+      </w:r>
+    </w:p>
+    <w:p>
+      <w:r>
+        <w:drawing>
+          <wp:inline xmlns:a="http://schemas.openxmlformats.org/drawingml/2006/main" xmlns:pic="http://schemas.openxmlformats.org/drawingml/2006/picture">
+            <wp:extent cx="6080760" cy="3197466"/>
+            <wp:docPr id="5" name="Picture 5" descr="Annotated Omni application screenshot: Complete the assessment plan; contains synthetic demonstration data"/>
+            <wp:cNvGraphicFramePr>
+              <a:graphicFrameLocks noChangeAspect="1"/>
+            </wp:cNvGraphicFramePr>
+            <a:graphic>
+              <a:graphicData uri="http://schemas.openxmlformats.org/drawingml/2006/picture">
+                <pic:pic>
+                  <pic:nvPicPr>
+                    <pic:cNvPr id="0" name="06-assessment-plan.png"/>
+                    <pic:cNvPicPr/>
+                  </pic:nvPicPr>
+                  <pic:blipFill>
+                    <a:blip r:embed="rId15"/>
+                    <a:stretch>
+                      <a:fillRect/>
+                    </a:stretch>
+                  </pic:blipFill>
+                  <pic:spPr>
+                    <a:xfrm>
+                      <a:off x="0" y="0"/>
+                      <a:ext cx="6080760" cy="3197466"/>
+                    </a:xfrm>
+                    <a:prstGeom prst="rect"/>
+                  </pic:spPr>
+                </pic:pic>
+              </a:graphicData>
+            </a:graphic>
+          </wp:inline>
+        </w:drawing>
+      </w:r>
+    </w:p>
+    <w:p>
+      <w:pPr>
+        <w:jc w:val="center"/>
+      </w:pPr>
+      <w:r>
+        <w:rPr>
+          <w:rFonts w:ascii="Aptos" w:hAnsi="Aptos"/>
+          <w:i/>
+          <w:color w:val="667085"/>
+          <w:sz w:val="18"/>
+        </w:rPr>
+        <w:t>Illustration: Complete the assessment plan</w:t>
+      </w:r>
+    </w:p>
+    <w:p>
+      <w:pPr>
+        <w:ind w:left="259" w:hanging="259"/>
+      </w:pPr>
+      <w:r>
+        <w:rPr>
+          <w:rFonts w:ascii="Aptos" w:hAnsi="Aptos"/>
+          <w:b/>
+          <w:color w:val="15324B"/>
+          <w:sz w:val="20"/>
+        </w:rPr>
+        <w:t xml:space="preserve">1  </w:t>
+      </w:r>
+      <w:r>
+        <w:rPr>
+          <w:rFonts w:ascii="Aptos" w:hAnsi="Aptos"/>
+          <w:color w:val="1F2933"/>
+          <w:sz w:val="20"/>
+        </w:rPr>
+        <w:t>Define dates, boundaries, locations, and methodology.</w:t>
+      </w:r>
+    </w:p>
+    <w:p>
+      <w:pPr>
+        <w:ind w:left="259" w:hanging="259"/>
+      </w:pPr>
+      <w:r>
+        <w:rPr>
+          <w:rFonts w:ascii="Aptos" w:hAnsi="Aptos"/>
+          <w:b/>
+          <w:color w:val="15324B"/>
+          <w:sz w:val="20"/>
+        </w:rPr>
+        <w:t xml:space="preserve">2  </w:t>
+      </w:r>
+      <w:r>
+        <w:rPr>
+          <w:rFonts w:ascii="Aptos" w:hAnsi="Aptos"/>
+          <w:color w:val="1F2933"/>
+          <w:sz w:val="20"/>
+        </w:rPr>
+        <w:t>Assign the assessment team and team roles.</w:t>
+      </w:r>
+    </w:p>
+    <w:p>
+      <w:pPr>
+        <w:ind w:left="259" w:hanging="259"/>
+      </w:pPr>
+      <w:r>
+        <w:rPr>
+          <w:rFonts w:ascii="Aptos" w:hAnsi="Aptos"/>
+          <w:b/>
+          <w:color w:val="15324B"/>
+          <w:sz w:val="20"/>
+        </w:rPr>
+        <w:t xml:space="preserve">3  </w:t>
+      </w:r>
+      <w:r>
+        <w:rPr>
+          <w:rFonts w:ascii="Aptos" w:hAnsi="Aptos"/>
+          <w:color w:val="1F2933"/>
+          <w:sz w:val="20"/>
+        </w:rPr>
+        <w:t>Save the plan after confirming optional risk settings.</w:t>
+      </w:r>
+    </w:p>
+    <w:p>
+      <w:r>
+        <w:br w:type="page"/>
+      </w:r>
+    </w:p>
+    <w:p>
+      <w:pPr>
+        <w:pStyle w:val="Heading2"/>
+      </w:pPr>
+      <w:r>
+        <w:t>Execute assessment objectives</w:t>
+      </w:r>
+    </w:p>
+    <w:p>
+      <w:r>
+        <w:drawing>
+          <wp:inline xmlns:a="http://schemas.openxmlformats.org/drawingml/2006/main" xmlns:pic="http://schemas.openxmlformats.org/drawingml/2006/picture">
+            <wp:extent cx="6080760" cy="3197466"/>
+            <wp:docPr id="6" name="Picture 6" descr="Annotated Omni application screenshot: Execute assessment objectives; contains synthetic demonstration data"/>
+            <wp:cNvGraphicFramePr>
+              <a:graphicFrameLocks noChangeAspect="1"/>
+            </wp:cNvGraphicFramePr>
+            <a:graphic>
+              <a:graphicData uri="http://schemas.openxmlformats.org/drawingml/2006/picture">
+                <pic:pic>
+                  <pic:nvPicPr>
+                    <pic:cNvPr id="0" name="07-assessment-execution.png"/>
+                    <pic:cNvPicPr/>
+                  </pic:nvPicPr>
+                  <pic:blipFill>
+                    <a:blip r:embed="rId16"/>
+                    <a:stretch>
+                      <a:fillRect/>
+                    </a:stretch>
+                  </pic:blipFill>
+                  <pic:spPr>
+                    <a:xfrm>
+                      <a:off x="0" y="0"/>
+                      <a:ext cx="6080760" cy="3197466"/>
+                    </a:xfrm>
+                    <a:prstGeom prst="rect"/>
+                  </pic:spPr>
+                </pic:pic>
+              </a:graphicData>
+            </a:graphic>
+          </wp:inline>
+        </w:drawing>
+      </w:r>
+    </w:p>
+    <w:p>
+      <w:pPr>
+        <w:jc w:val="center"/>
+      </w:pPr>
+      <w:r>
+        <w:rPr>
+          <w:rFonts w:ascii="Aptos" w:hAnsi="Aptos"/>
+          <w:i/>
+          <w:color w:val="667085"/>
+          <w:sz w:val="18"/>
+        </w:rPr>
+        <w:t>Illustration: Execute assessment objectives</w:t>
+      </w:r>
+    </w:p>
+    <w:p>
+      <w:pPr>
+        <w:ind w:left="259" w:hanging="259"/>
+      </w:pPr>
+      <w:r>
+        <w:rPr>
+          <w:rFonts w:ascii="Aptos" w:hAnsi="Aptos"/>
+          <w:b/>
+          <w:color w:val="15324B"/>
+          <w:sz w:val="20"/>
+        </w:rPr>
+        <w:t xml:space="preserve">1  </w:t>
+      </w:r>
+      <w:r>
+        <w:rPr>
+          <w:rFonts w:ascii="Aptos" w:hAnsi="Aptos"/>
+          <w:color w:val="1F2933"/>
+          <w:sz w:val="20"/>
+        </w:rPr>
+        <w:t>Record interviews, samples, and tests when the methodology requires them.</w:t>
+      </w:r>
+    </w:p>
+    <w:p>
+      <w:pPr>
+        <w:ind w:left="259" w:hanging="259"/>
+      </w:pPr>
+      <w:r>
+        <w:rPr>
+          <w:rFonts w:ascii="Aptos" w:hAnsi="Aptos"/>
+          <w:b/>
+          <w:color w:val="15324B"/>
+          <w:sz w:val="20"/>
+        </w:rPr>
+        <w:t xml:space="preserve">2  </w:t>
+      </w:r>
+      <w:r>
+        <w:rPr>
+          <w:rFonts w:ascii="Aptos" w:hAnsi="Aptos"/>
+          <w:color w:val="1F2933"/>
+          <w:sz w:val="20"/>
+        </w:rPr>
+        <w:t>Use the status metrics and filters to identify remaining objective work.</w:t>
+      </w:r>
+    </w:p>
+    <w:p>
+      <w:pPr>
+        <w:ind w:left="259" w:hanging="259"/>
+      </w:pPr>
+      <w:r>
+        <w:rPr>
+          <w:rFonts w:ascii="Aptos" w:hAnsi="Aptos"/>
+          <w:b/>
+          <w:color w:val="15324B"/>
+          <w:sz w:val="20"/>
+        </w:rPr>
+        <w:t xml:space="preserve">3  </w:t>
+      </w:r>
+      <w:r>
+        <w:rPr>
+          <w:rFonts w:ascii="Aptos" w:hAnsi="Aptos"/>
+          <w:color w:val="1F2933"/>
+          <w:sz w:val="20"/>
+        </w:rPr>
+        <w:t>Select Assess to document the objective status, notes, and supporting artifacts.</w:t>
+      </w:r>
+    </w:p>
+    <w:p>
+      <w:r>
+        <w:br w:type="page"/>
+      </w:r>
+    </w:p>
+    <w:p>
+      <w:pPr>
+        <w:pStyle w:val="Heading2"/>
+      </w:pPr>
+      <w:r>
+        <w:t>Record the control conclusion</w:t>
+      </w:r>
+    </w:p>
+    <w:p>
+      <w:r>
+        <w:drawing>
+          <wp:inline xmlns:a="http://schemas.openxmlformats.org/drawingml/2006/main" xmlns:pic="http://schemas.openxmlformats.org/drawingml/2006/picture">
+            <wp:extent cx="6080760" cy="3197466"/>
+            <wp:docPr id="7" name="Picture 7" descr="Annotated Omni application screenshot: Record the control conclusion; contains synthetic demonstration data"/>
+            <wp:cNvGraphicFramePr>
+              <a:graphicFrameLocks noChangeAspect="1"/>
+            </wp:cNvGraphicFramePr>
+            <a:graphic>
+              <a:graphicData uri="http://schemas.openxmlformats.org/drawingml/2006/picture">
+                <pic:pic>
+                  <pic:nvPicPr>
+                    <pic:cNvPr id="0" name="08-control-result.png"/>
+                    <pic:cNvPicPr/>
+                  </pic:nvPicPr>
+                  <pic:blipFill>
+                    <a:blip r:embed="rId17"/>
+                    <a:stretch>
+                      <a:fillRect/>
+                    </a:stretch>
+                  </pic:blipFill>
+                  <pic:spPr>
+                    <a:xfrm>
+                      <a:off x="0" y="0"/>
+                      <a:ext cx="6080760" cy="3197466"/>
+                    </a:xfrm>
+                    <a:prstGeom prst="rect"/>
+                  </pic:spPr>
+                </pic:pic>
+              </a:graphicData>
+            </a:graphic>
+          </wp:inline>
+        </w:drawing>
+      </w:r>
+    </w:p>
+    <w:p>
+      <w:pPr>
+        <w:jc w:val="center"/>
+      </w:pPr>
+      <w:r>
+        <w:rPr>
+          <w:rFonts w:ascii="Aptos" w:hAnsi="Aptos"/>
+          <w:i/>
+          <w:color w:val="667085"/>
+          <w:sz w:val="18"/>
+        </w:rPr>
+        <w:t>Illustration: Record the control conclusion</w:t>
+      </w:r>
+    </w:p>
+    <w:p>
+      <w:pPr>
+        <w:ind w:left="259" w:hanging="259"/>
+      </w:pPr>
+      <w:r>
+        <w:rPr>
+          <w:rFonts w:ascii="Aptos" w:hAnsi="Aptos"/>
+          <w:b/>
+          <w:color w:val="15324B"/>
+          <w:sz w:val="20"/>
+        </w:rPr>
+        <w:t xml:space="preserve">1  </w:t>
+      </w:r>
+      <w:r>
+        <w:rPr>
+          <w:rFonts w:ascii="Aptos" w:hAnsi="Aptos"/>
+          <w:color w:val="1F2933"/>
+          <w:sz w:val="20"/>
+        </w:rPr>
+        <w:t>Select the supported control status and implementation state.</w:t>
+      </w:r>
+    </w:p>
+    <w:p>
+      <w:pPr>
+        <w:ind w:left="259" w:hanging="259"/>
+      </w:pPr>
+      <w:r>
+        <w:rPr>
+          <w:rFonts w:ascii="Aptos" w:hAnsi="Aptos"/>
+          <w:b/>
+          <w:color w:val="15324B"/>
+          <w:sz w:val="20"/>
+        </w:rPr>
+        <w:t xml:space="preserve">2  </w:t>
+      </w:r>
+      <w:r>
+        <w:rPr>
+          <w:rFonts w:ascii="Aptos" w:hAnsi="Aptos"/>
+          <w:color w:val="1F2933"/>
+          <w:sz w:val="20"/>
+        </w:rPr>
+        <w:t>Use Assessor Notes/Findings for either a conformity statement or a finding.</w:t>
+      </w:r>
+    </w:p>
+    <w:p>
+      <w:pPr>
+        <w:ind w:left="259" w:hanging="259"/>
+      </w:pPr>
+      <w:r>
+        <w:rPr>
+          <w:rFonts w:ascii="Aptos" w:hAnsi="Aptos"/>
+          <w:b/>
+          <w:color w:val="15324B"/>
+          <w:sz w:val="20"/>
+        </w:rPr>
+        <w:t xml:space="preserve">3  </w:t>
+      </w:r>
+      <w:r>
+        <w:rPr>
+          <w:rFonts w:ascii="Aptos" w:hAnsi="Aptos"/>
+          <w:color w:val="1F2933"/>
+          <w:sz w:val="20"/>
+        </w:rPr>
+        <w:t>Confirm ownership, dates, and evidence, then save and refresh the dashboard.</w:t>
+      </w:r>
+    </w:p>
+    <w:p>
+      <w:r>
+        <w:br w:type="page"/>
+      </w:r>
+    </w:p>
+    <w:p>
+      <w:pPr>
+        <w:pStyle w:val="Heading2"/>
+      </w:pPr>
+      <w:r>
+        <w:t>Manage evidence</w:t>
+      </w:r>
+    </w:p>
+    <w:p>
+      <w:r>
+        <w:drawing>
+          <wp:inline xmlns:a="http://schemas.openxmlformats.org/drawingml/2006/main" xmlns:pic="http://schemas.openxmlformats.org/drawingml/2006/picture">
+            <wp:extent cx="6080760" cy="3197466"/>
+            <wp:docPr id="8" name="Picture 8" descr="Annotated Omni application screenshot: Manage evidence; contains synthetic demonstration data"/>
+            <wp:cNvGraphicFramePr>
+              <a:graphicFrameLocks noChangeAspect="1"/>
+            </wp:cNvGraphicFramePr>
+            <a:graphic>
+              <a:graphicData uri="http://schemas.openxmlformats.org/drawingml/2006/picture">
+                <pic:pic>
+                  <pic:nvPicPr>
+                    <pic:cNvPr id="0" name="09-evidence-workspace.png"/>
+                    <pic:cNvPicPr/>
+                  </pic:nvPicPr>
+                  <pic:blipFill>
+                    <a:blip r:embed="rId18"/>
+                    <a:stretch>
+                      <a:fillRect/>
+                    </a:stretch>
+                  </pic:blipFill>
+                  <pic:spPr>
+                    <a:xfrm>
+                      <a:off x="0" y="0"/>
+                      <a:ext cx="6080760" cy="3197466"/>
+                    </a:xfrm>
+                    <a:prstGeom prst="rect"/>
+                  </pic:spPr>
+                </pic:pic>
+              </a:graphicData>
+            </a:graphic>
+          </wp:inline>
+        </w:drawing>
+      </w:r>
+    </w:p>
+    <w:p>
+      <w:pPr>
+        <w:jc w:val="center"/>
+      </w:pPr>
+      <w:r>
+        <w:rPr>
+          <w:rFonts w:ascii="Aptos" w:hAnsi="Aptos"/>
+          <w:i/>
+          <w:color w:val="667085"/>
+          <w:sz w:val="18"/>
+        </w:rPr>
+        <w:t>Illustration: Manage evidence</w:t>
+      </w:r>
+    </w:p>
+    <w:p>
+      <w:pPr>
+        <w:ind w:left="259" w:hanging="259"/>
+      </w:pPr>
+      <w:r>
+        <w:rPr>
+          <w:rFonts w:ascii="Aptos" w:hAnsi="Aptos"/>
+          <w:b/>
+          <w:color w:val="15324B"/>
+          <w:sz w:val="20"/>
+        </w:rPr>
+        <w:t xml:space="preserve">1  </w:t>
+      </w:r>
+      <w:r>
+        <w:rPr>
+          <w:rFonts w:ascii="Aptos" w:hAnsi="Aptos"/>
+          <w:color w:val="1F2933"/>
+          <w:sz w:val="20"/>
+        </w:rPr>
+        <w:t>Filter and track evidence requests through the collection workflow.</w:t>
+      </w:r>
+    </w:p>
+    <w:p>
+      <w:pPr>
+        <w:ind w:left="259" w:hanging="259"/>
+      </w:pPr>
+      <w:r>
+        <w:rPr>
+          <w:rFonts w:ascii="Aptos" w:hAnsi="Aptos"/>
+          <w:b/>
+          <w:color w:val="15324B"/>
+          <w:sz w:val="20"/>
+        </w:rPr>
+        <w:t xml:space="preserve">2  </w:t>
+      </w:r>
+      <w:r>
+        <w:rPr>
+          <w:rFonts w:ascii="Aptos" w:hAnsi="Aptos"/>
+          <w:color w:val="1F2933"/>
+          <w:sz w:val="20"/>
+        </w:rPr>
+        <w:t>Open a request to manage ownership, controls, due dates, and artifacts.</w:t>
+      </w:r>
+    </w:p>
+    <w:p>
+      <w:pPr>
+        <w:ind w:left="259" w:hanging="259"/>
+      </w:pPr>
+      <w:r>
+        <w:rPr>
+          <w:rFonts w:ascii="Aptos" w:hAnsi="Aptos"/>
+          <w:b/>
+          <w:color w:val="15324B"/>
+          <w:sz w:val="20"/>
+        </w:rPr>
+        <w:t xml:space="preserve">3  </w:t>
+      </w:r>
+      <w:r>
+        <w:rPr>
+          <w:rFonts w:ascii="Aptos" w:hAnsi="Aptos"/>
+          <w:color w:val="1F2933"/>
+          <w:sz w:val="20"/>
+        </w:rPr>
+        <w:t>Register a file or governed external reference as a supporting artifact.</w:t>
+      </w:r>
+    </w:p>
+    <w:p>
+      <w:r>
+        <w:br w:type="page"/>
+      </w:r>
+    </w:p>
+    <w:p>
+      <w:pPr>
+        <w:pStyle w:val="Heading2"/>
+      </w:pPr>
+      <w:r>
+        <w:t>Generate deliverables</w:t>
+      </w:r>
+    </w:p>
+    <w:p>
+      <w:r>
+        <w:drawing>
+          <wp:inline xmlns:a="http://schemas.openxmlformats.org/drawingml/2006/main" xmlns:pic="http://schemas.openxmlformats.org/drawingml/2006/picture">
+            <wp:extent cx="6080760" cy="3197466"/>
+            <wp:docPr id="9" name="Picture 9" descr="Annotated Omni application screenshot: Generate deliverables; contains synthetic demonstration data"/>
+            <wp:cNvGraphicFramePr>
+              <a:graphicFrameLocks noChangeAspect="1"/>
+            </wp:cNvGraphicFramePr>
+            <a:graphic>
+              <a:graphicData uri="http://schemas.openxmlformats.org/drawingml/2006/picture">
+                <pic:pic>
+                  <pic:nvPicPr>
+                    <pic:cNvPr id="0" name="12-report-center.png"/>
+                    <pic:cNvPicPr/>
+                  </pic:nvPicPr>
+                  <pic:blipFill>
+                    <a:blip r:embed="rId19"/>
+                    <a:stretch>
+                      <a:fillRect/>
+                    </a:stretch>
+                  </pic:blipFill>
+                  <pic:spPr>
+                    <a:xfrm>
+                      <a:off x="0" y="0"/>
+                      <a:ext cx="6080760" cy="3197466"/>
+                    </a:xfrm>
+                    <a:prstGeom prst="rect"/>
+                  </pic:spPr>
+                </pic:pic>
+              </a:graphicData>
+            </a:graphic>
+          </wp:inline>
+        </w:drawing>
+      </w:r>
+    </w:p>
+    <w:p>
+      <w:pPr>
+        <w:jc w:val="center"/>
+      </w:pPr>
+      <w:r>
+        <w:rPr>
+          <w:rFonts w:ascii="Aptos" w:hAnsi="Aptos"/>
+          <w:i/>
+          <w:color w:val="667085"/>
+          <w:sz w:val="18"/>
+        </w:rPr>
+        <w:t>Illustration: Generate deliverables</w:t>
+      </w:r>
+    </w:p>
+    <w:p>
+      <w:pPr>
+        <w:ind w:left="259" w:hanging="259"/>
+      </w:pPr>
+      <w:r>
+        <w:rPr>
+          <w:rFonts w:ascii="Aptos" w:hAnsi="Aptos"/>
+          <w:b/>
+          <w:color w:val="15324B"/>
+          <w:sz w:val="20"/>
+        </w:rPr>
+        <w:t xml:space="preserve">1  </w:t>
+      </w:r>
+      <w:r>
+        <w:rPr>
+          <w:rFonts w:ascii="Aptos" w:hAnsi="Aptos"/>
+          <w:color w:val="1F2933"/>
+          <w:sz w:val="20"/>
+        </w:rPr>
+        <w:t>Review blockers and warnings before generating final deliverables.</w:t>
+      </w:r>
+    </w:p>
+    <w:p>
+      <w:pPr>
+        <w:ind w:left="259" w:hanging="259"/>
+      </w:pPr>
+      <w:r>
+        <w:rPr>
+          <w:rFonts w:ascii="Aptos" w:hAnsi="Aptos"/>
+          <w:b/>
+          <w:color w:val="15324B"/>
+          <w:sz w:val="20"/>
+        </w:rPr>
+        <w:t xml:space="preserve">2  </w:t>
+      </w:r>
+      <w:r>
+        <w:rPr>
+          <w:rFonts w:ascii="Aptos" w:hAnsi="Aptos"/>
+          <w:color w:val="1F2933"/>
+          <w:sz w:val="20"/>
+        </w:rPr>
+        <w:t>Select the workbook, Word plan, framework, consolidated, traceability, or package output.</w:t>
+      </w:r>
+    </w:p>
+    <w:p>
+      <w:pPr>
+        <w:ind w:left="259" w:hanging="259"/>
+      </w:pPr>
+      <w:r>
+        <w:rPr>
+          <w:rFonts w:ascii="Aptos" w:hAnsi="Aptos"/>
+          <w:b/>
+          <w:color w:val="15324B"/>
+          <w:sz w:val="20"/>
+        </w:rPr>
+        <w:t xml:space="preserve">3  </w:t>
+      </w:r>
+      <w:r>
+        <w:rPr>
+          <w:rFonts w:ascii="Aptos" w:hAnsi="Aptos"/>
+          <w:color w:val="1F2933"/>
+          <w:sz w:val="20"/>
+        </w:rPr>
+        <w:t>Use document history to confirm version, generator, date, and size.</w:t>
+      </w:r>
     </w:p>
     <w:p>
       <w:pPr>
@@ -6325,92 +7424,29 @@
   <w:p>
     <w:pPr>
       <w:pStyle w:val="Footer"/>
+      <w:jc w:val="center"/>
     </w:pPr>
+    <w:r>
+      <w:rPr>
+        <w:rFonts w:ascii="Aptos" w:hAnsi="Aptos"/>
+        <w:color w:val="667085"/>
+        <w:sz w:val="16"/>
+      </w:rPr>
+      <w:t xml:space="preserve">Omni by R!SC  |  Version 1.1  |  August 2026  |  Page </w:t>
+    </w:r>
+    <w:r>
+      <w:rPr>
+        <w:rFonts w:ascii="Aptos" w:hAnsi="Aptos"/>
+        <w:color w:val="667085"/>
+        <w:sz w:val="16"/>
+      </w:rPr>
+      <w:fldChar w:fldCharType="begin"/>
+      <w:instrText xml:space="preserve"> PAGE </w:instrText>
+      <w:fldChar w:fldCharType="separate"/>
+      <w:t>1</w:t>
+      <w:fldChar w:fldCharType="end"/>
+    </w:r>
   </w:p>
-  <w:tbl>
-    <w:tblPr>
-      <w:tblStyle w:val="TableGrid"/>
-      <w:tblW w:type="dxa" w:w="9360"/>
-      <w:jc w:val="left"/>
-      <w:tblLayout w:type="fixed"/>
-      <w:tblLook w:firstColumn="1" w:firstRow="1" w:lastColumn="0" w:lastRow="0" w:noHBand="0" w:noVBand="1" w:val="04A0"/>
-      <w:tblInd w:w="120" w:type="dxa"/>
-    </w:tblPr>
-    <w:tblGrid>
-      <w:gridCol w:w="6500"/>
-      <w:gridCol w:w="2860"/>
-    </w:tblGrid>
-    <w:tr>
-      <w:trPr>
-        <w:cantSplit w:val="true"/>
-      </w:trPr>
-      <w:tc>
-        <w:tcPr>
-          <w:tcW w:type="dxa" w:w="6500"/>
-          <w:tcMar>
-            <w:top w:w="90" w:type="dxa"/>
-            <w:start w:w="120" w:type="dxa"/>
-            <w:bottom w:w="90" w:type="dxa"/>
-            <w:end w:w="120" w:type="dxa"/>
-          </w:tcMar>
-          <w:vAlign w:val="center"/>
-          <w:tcBorders>
-            <w:top w:val="nil"/>
-            <w:left w:val="nil"/>
-            <w:bottom w:val="nil"/>
-            <w:right w:val="nil"/>
-            <w:insideH w:val="nil"/>
-            <w:insideV w:val="nil"/>
-          </w:tcBorders>
-        </w:tcPr>
-        <w:p>
-          <w:r>
-            <w:rPr>
-              <w:rFonts w:ascii="Aptos" w:hAnsi="Aptos"/>
-              <w:color w:val="667085"/>
-              <w:sz w:val="16"/>
-            </w:rPr>
-            <w:t>Omni by R!SC  |  Version 1.0  |  August 2026</w:t>
-          </w:r>
-        </w:p>
-      </w:tc>
-      <w:tc>
-        <w:tcPr>
-          <w:tcW w:type="dxa" w:w="2860"/>
-          <w:tcMar>
-            <w:top w:w="90" w:type="dxa"/>
-            <w:start w:w="120" w:type="dxa"/>
-            <w:bottom w:w="90" w:type="dxa"/>
-            <w:end w:w="120" w:type="dxa"/>
-          </w:tcMar>
-          <w:vAlign w:val="center"/>
-          <w:tcBorders>
-            <w:top w:val="nil"/>
-            <w:left w:val="nil"/>
-            <w:bottom w:val="nil"/>
-            <w:right w:val="nil"/>
-            <w:insideH w:val="nil"/>
-            <w:insideV w:val="nil"/>
-          </w:tcBorders>
-        </w:tcPr>
-        <w:p>
-          <w:pPr>
-            <w:jc w:val="right"/>
-          </w:pPr>
-          <w:r>
-            <w:rPr>
-              <w:rFonts w:ascii="Aptos" w:hAnsi="Aptos"/>
-              <w:color w:val="667085"/>
-              <w:sz w:val="18"/>
-            </w:rPr>
-            <w:fldChar w:fldCharType="begin"/>
-            <w:instrText xml:space="preserve"> PAGE </w:instrText>
-            <w:fldChar w:fldCharType="end"/>
-          </w:r>
-        </w:p>
-      </w:tc>
-    </w:tr>
-  </w:tbl>
 </w:ftr>
 </file>
 

</xml_diff>